<commit_message>
Upgrade Azure DevOps and sprint work from "In Aneignung" to proven practice
The applicant confirmed using Azure DevOps and working in sprints at AKG,
which covers the posting's test-management-tool and agile-environment
requirements. Move both into the practice sections of CV and cover letter,
reframe Jira/TestRail as a tool switch rather than a gap, and re-prioritize
the learning plan onto the remaining gap (test automation, API tests, Git).

Co-Authored-By: Claude Opus 5 <noreply@anthropic.com>
Claude-Session: https://claude.ai/code/session_01FU9RUXkiipMM9QnkLyeQPz
</commit_message>
<xml_diff>
--- a/output/Anschreiben_PwC_QA.docx
+++ b/output/Anschreiben_PwC_QA.docx
@@ -124,7 +124,7 @@
         <w:spacing w:after="160"/>
       </w:pPr>
       <w:r>
-        <w:t>In der Produktabnahme plane und führe ich manuelle Softwaretests durch: vom Testfallentwurf über die Ausführung bis zur Abnahmeempfehlung. Gefundene Fehler erfasse ich reproduzierbar, priorisiere sie, verfolge sie bis zum Retest nach und dokumentiere Testverlauf sowie Ergebnisse strukturiert. Dabei habe ich gelernt, dass ein Fehlerbericht erst dann gut ist, wenn die Entwicklung ohne Rückfrage damit arbeiten kann – kommunikationsstarkes Fehlerreporting ist für mich kein Nebenprodukt, sondern Teil der Aufgabe. Die enge Abstimmung mit Entwicklungs- und Fachteams gehört für mich zum Alltag.</w:t>
+        <w:t>In der Produktabnahme plane und führe ich manuelle Softwaretests durch: vom Testfallentwurf über die Ausführung bis zur Abnahmeempfehlung. Gefundene Fehler erfasse ich reproduzierbar in Azure DevOps, priorisiere sie, verfolge sie bis zum Retest nach und dokumentiere Testverlauf sowie Ergebnisse strukturiert. Wir arbeiten dabei in Sprints, sodass ich gewohnt bin, Testumfang und Abnahmekriterien eng am Entwicklungszyklus abzustimmen. Dabei habe ich gelernt, dass ein Fehlerbericht erst dann gut ist, wenn die Entwicklung ohne Rückfrage damit arbeiten kann – kommunikationsstarkes Fehlerreporting ist für mich kein Nebenprodukt, sondern Teil der Aufgabe.</w:t>
       </w:r>
     </w:p>
     <w:p>
@@ -132,7 +132,7 @@
         <w:spacing w:after="160"/>
       </w:pPr>
       <w:r>
-        <w:t>Mein Studium des Wirtschaftsingenieurwesens an der HTW Berlin bringt neben Programmierung (Python, C#) und Datenbanken vor allem eine zweite Perspektive mit: Ich denke Anforderungen von der fachlichen Seite her und übersetze zwischen Business und Technik. Für ein cross-funktionales Team, das gesellschaftliche Problemstellungen in Public Sector und Energy in reale Lösungen überführt, sehe ich darin einen echten Mehrwert. Offen sage ich auch, wo ich stehe: Testautomatisierung mit Selenium, Cypress und JUnit, API- und Performance-Tests sowie der routinierte Umgang mit Jira und Git baue ich derzeit gezielt im Selbststudium auf – strukturiert, mit eigenen kleinen Testprojekten und der klaren Absicht, das bei Ihnen in die Praxis zu bringen. Was ich sicher mitbringe, ist die Grundlage, auf der Automatisierung erst sinnvoll wird: systematisches Testdenken, Detailgenauigkeit und saubere Dokumentation.</w:t>
+        <w:t>Mein Studium des Wirtschaftsingenieurwesens an der HTW Berlin bringt neben Programmierung (Python, C#) und Datenbanken vor allem eine zweite Perspektive mit: Ich denke Anforderungen von der fachlichen Seite her und übersetze zwischen Business und Technik. Für ein cross-funktionales Team, das gesellschaftliche Problemstellungen in Public Sector und Energy in reale Lösungen überführt, sehe ich darin einen echten Mehrwert. Offen sage ich auch, wo ich stehe: Testautomatisierung mit Selenium, Cypress und JUnit sowie API- und Performance-Tests baue ich derzeit gezielt im Selbststudium auf – strukturiert, mit eigenen kleinen Testprojekten und der klaren Absicht, das bei Ihnen in die Praxis zu bringen. Als Testmanagement-Tool nutze ich Azure DevOps; der Umstieg auf Jira oder TestRail ist für mich eine Frage von Tagen, nicht von Monaten. Was ich sicher mitbringe, ist die Grundlage, auf der Automatisierung erst sinnvoll wird: systematisches Testdenken, Detailgenauigkeit und saubere Dokumentation.</w:t>
       </w:r>
     </w:p>
     <w:p>
@@ -177,7 +177,7 @@
           <w:color w:val="888888"/>
           <w:sz w:val="18"/>
         </w:rPr>
-        <w:t>HINWEIS (vor Versand löschen): Platzhalter {{...}} ersetzen (Adresse des Standorts, auf den du dich bewirbst, Datum, Referenznummer aus der Anzeige). Absatz 4 anpassen, falls du Jira, Git oder Scrum bei AKG bereits produktiv nutzt – dann gehören sie in Absatz 2 als Praxis.</w:t>
+        <w:t>HINWEIS (vor Versand löschen): Platzhalter {{...}} ersetzen (Adresse des Standorts, auf den du dich bewirbst, Datum, Referenznummer aus der Anzeige). Absatz 4 anpassen, falls du bei AKG auch mit Git/Azure Repos arbeitest – dann gehört das in Absatz 2 als Praxis.</w:t>
       </w:r>
     </w:p>
     <w:sectPr>

</xml_diff>

<commit_message>
Move Git/Azure Repos and Azure Test Plans into proven practice
The applicant confirmed using Azure Repos for version control and Azure Test
Plans for test-case management. Both requirements now sit in the practice
sections of CV and cover letter, leaving test automation and API/performance
testing as the only remaining gap. Condense the AKG bullet list back to six
so the entry stays readable.

Co-Authored-By: Claude Opus 5 <noreply@anthropic.com>
Claude-Session: https://claude.ai/code/session_01FU9RUXkiipMM9QnkLyeQPz
</commit_message>
<xml_diff>
--- a/output/Anschreiben_PwC_QA.docx
+++ b/output/Anschreiben_PwC_QA.docx
@@ -124,7 +124,7 @@
         <w:spacing w:after="160"/>
       </w:pPr>
       <w:r>
-        <w:t>In der Produktabnahme plane und führe ich manuelle Softwaretests durch: vom Testfallentwurf über die Ausführung bis zur Abnahmeempfehlung. Gefundene Fehler erfasse ich reproduzierbar in Azure DevOps, priorisiere sie, verfolge sie bis zum Retest nach und dokumentiere Testverlauf sowie Ergebnisse strukturiert. Wir arbeiten dabei in Sprints, sodass ich gewohnt bin, Testumfang und Abnahmekriterien eng am Entwicklungszyklus abzustimmen. Dabei habe ich gelernt, dass ein Fehlerbericht erst dann gut ist, wenn die Entwicklung ohne Rückfrage damit arbeiten kann – kommunikationsstarkes Fehlerreporting ist für mich kein Nebenprodukt, sondern Teil der Aufgabe.</w:t>
+        <w:t>In der Produktabnahme plane und führe ich manuelle Softwaretests durch: vom Testfallentwurf über die Ausführung bis zur Abnahmeempfehlung. Meine Testfälle und Testläufe verwalte ich in Azure DevOps Test Plans, gefundene Fehler erfasse ich reproduzierbar, priorisiere sie und verfolge sie bis zum Retest nach – über Git beziehungsweise Azure Repos ordne ich sie dabei versionsgenau dem jeweiligen Codestand zu. Wir arbeiten in Sprints, sodass ich gewohnt bin, Testumfang und Abnahmekriterien eng am Entwicklungszyklus abzustimmen. Dabei habe ich gelernt, dass ein Fehlerbericht erst dann gut ist, wenn die Entwicklung ohne Rückfrage damit arbeiten kann – kommunikationsstarkes Fehlerreporting ist für mich kein Nebenprodukt, sondern Teil der Aufgabe.</w:t>
       </w:r>
     </w:p>
     <w:p>
@@ -132,7 +132,7 @@
         <w:spacing w:after="160"/>
       </w:pPr>
       <w:r>
-        <w:t>Mein Studium des Wirtschaftsingenieurwesens an der HTW Berlin bringt neben Programmierung (Python, C#) und Datenbanken vor allem eine zweite Perspektive mit: Ich denke Anforderungen von der fachlichen Seite her und übersetze zwischen Business und Technik. Für ein cross-funktionales Team, das gesellschaftliche Problemstellungen in Public Sector und Energy in reale Lösungen überführt, sehe ich darin einen echten Mehrwert. Offen sage ich auch, wo ich stehe: Testautomatisierung mit Selenium, Cypress und JUnit sowie API- und Performance-Tests baue ich derzeit gezielt im Selbststudium auf – strukturiert, mit eigenen kleinen Testprojekten und der klaren Absicht, das bei Ihnen in die Praxis zu bringen. Als Testmanagement-Tool nutze ich Azure DevOps; der Umstieg auf Jira oder TestRail ist für mich eine Frage von Tagen, nicht von Monaten. Was ich sicher mitbringe, ist die Grundlage, auf der Automatisierung erst sinnvoll wird: systematisches Testdenken, Detailgenauigkeit und saubere Dokumentation.</w:t>
+        <w:t>Mein Studium des Wirtschaftsingenieurwesens an der HTW Berlin bringt neben Programmierung (Python, C#) und Datenbanken vor allem eine zweite Perspektive mit: Ich denke Anforderungen von der fachlichen Seite her und übersetze zwischen Business und Technik. Für ein cross-funktionales Team, das gesellschaftliche Problemstellungen in Public Sector und Energy in reale Lösungen überführt, sehe ich darin einen echten Mehrwert. Offen sage ich auch, wo ich stehe: Testautomatisierung mit Selenium, Cypress und JUnit sowie API- und Performance-Tests baue ich derzeit gezielt im Selbststudium auf – strukturiert, mit eigenen kleinen Testprojekten und der klaren Absicht, das bei Ihnen in die Praxis zu bringen. Als Testmanagement-Umgebung nutze ich Azure DevOps; der Umstieg auf Jira oder TestRail ist für mich eine Frage von Tagen, nicht von Monaten – die Konzepte dahinter sind dieselben. Was ich sicher mitbringe, ist die Grundlage, auf der Automatisierung erst sinnvoll wird: systematisches Testdenken, Detailgenauigkeit und saubere Dokumentation.</w:t>
       </w:r>
     </w:p>
     <w:p>
@@ -177,7 +177,7 @@
           <w:color w:val="888888"/>
           <w:sz w:val="18"/>
         </w:rPr>
-        <w:t>HINWEIS (vor Versand löschen): Platzhalter {{...}} ersetzen (Adresse des Standorts, auf den du dich bewirbst, Datum, Referenznummer aus der Anzeige). Absatz 4 anpassen, falls du bei AKG auch mit Git/Azure Repos arbeitest – dann gehört das in Absatz 2 als Praxis.</w:t>
+        <w:t>HINWEIS (vor Versand löschen): Platzhalter {{...}} ersetzen (Adresse des Standorts, auf den du dich bewirbst, Datum, Referenznummer aus der Anzeige) und diese Zeile entfernen.</w:t>
       </w:r>
     </w:p>
     <w:sectPr>

</xml_diff>

<commit_message>
Add API and performance testing as current practice
The applicant performs API and performance tests in the current role. Both are
named requirements in the posting, so they move from the self-study block into
the experience section, profile and cover letter; only security testing remains
listed as being built up. Split the cover letter's overloaded second paragraph
and trim the fourth so the letter stays on one page.

Co-Authored-By: Claude Opus 5 <noreply@anthropic.com>
Claude-Session: https://claude.ai/code/session_01FU9RUXkiipMM9QnkLyeQPz
</commit_message>
<xml_diff>
--- a/output/Anschreiben_PwC_QA.docx
+++ b/output/Anschreiben_PwC_QA.docx
@@ -124,7 +124,7 @@
         <w:spacing w:after="160"/>
       </w:pPr>
       <w:r>
-        <w:t>In der Produktabnahme plane und führe ich manuelle Softwaretests durch: vom Testfallentwurf über die Ausführung bis zur Abnahmeempfehlung. Die Testpläne dazu erstelle ich in enger Zusammenarbeit mit unserem Produktmanager – aus den Produktanforderungen leiten wir gemeinsam Testumfang, Testszenarien und Abnahmekriterien ab. Meine Testfälle und Testläufe verwalte ich in Azure DevOps Test Plans, gefundene Fehler erfasse ich reproduzierbar, priorisiere sie und verfolge sie bis zum Retest nach – über Git beziehungsweise Azure Repos ordne ich sie dabei versionsgenau dem jeweiligen Codestand zu. Wir arbeiten in Sprints, sodass ich gewohnt bin, Testumfang und Abnahmekriterien eng am Entwicklungszyklus abzustimmen. Dabei habe ich gelernt, dass ein Fehlerbericht erst dann gut ist, wenn die Entwicklung ohne Rückfrage damit arbeiten kann – kommunikationsstarkes Fehlerreporting ist für mich kein Nebenprodukt, sondern Teil der Aufgabe.</w:t>
+        <w:t>In der Produktabnahme plane und führe ich Softwaretests durch: vom Testfallentwurf über die Ausführung bis zur Abnahmeempfehlung. Die Testpläne dazu erstelle ich in enger Zusammenarbeit mit unserem Produktmanager – aus den Produktanforderungen leiten wir gemeinsam Testumfang, Testszenarien und Abnahmekriterien ab. Neben dem manuellen Test gehören API- und Performance-Tests zu meinen Aufgaben: Schnittstellen gegen die Spezifikation zu prüfen und zu sehen, wie sich das System unter Last verhält. Wir arbeiten in Sprints, sodass ich gewohnt bin, den Testumfang eng am Entwicklungszyklus abzustimmen.</w:t>
       </w:r>
     </w:p>
     <w:p>
@@ -132,7 +132,15 @@
         <w:spacing w:after="160"/>
       </w:pPr>
       <w:r>
-        <w:t>Mein Studium des Wirtschaftsingenieurwesens an der HTW Berlin bringt neben Programmierung (Python, C#) und Datenbanken vor allem eine zweite Perspektive mit: Ich denke Anforderungen von der fachlichen Seite her und übersetze zwischen Business und Technik. Für ein cross-funktionales Team, das gesellschaftliche Problemstellungen in Public Sector und Energy in reale Lösungen überführt, sehe ich darin einen echten Mehrwert. Offen sage ich auch, wo ich stehe: Testautomatisierung mit Selenium, Cypress und JUnit sowie API- und Performance-Tests baue ich derzeit gezielt im Selbststudium auf – strukturiert, mit eigenen kleinen Testprojekten und der klaren Absicht, das bei Ihnen in die Praxis zu bringen. Als Testmanagement-Umgebung nutze ich Azure DevOps; der Umstieg auf Jira oder TestRail ist für mich eine Frage von Tagen, nicht von Monaten – die Konzepte dahinter sind dieselben. Was ich sicher mitbringe, ist die Grundlage, auf der Automatisierung erst sinnvoll wird: systematisches Testdenken, Detailgenauigkeit und saubere Dokumentation.</w:t>
+        <w:t>Testfälle und Testläufe verwalte ich in Azure DevOps Test Plans; gefundene Fehler erfasse ich reproduzierbar, priorisiere sie und verfolge sie bis zum Retest nach – über Git beziehungsweise Azure Repos ordne ich sie versionsgenau dem jeweiligen Codestand zu. Dabei habe ich gelernt, dass ein Fehlerbericht erst dann gut ist, wenn die Entwicklung ohne Rückfrage damit arbeiten kann; kommunikationsstarkes Fehlerreporting ist für mich kein Nebenprodukt, sondern Teil der Aufgabe.</w:t>
+      </w:r>
+    </w:p>
+    <w:p>
+      <w:pPr>
+        <w:spacing w:after="160"/>
+      </w:pPr>
+      <w:r>
+        <w:t>Mein Studium des Wirtschaftsingenieurwesens an der HTW Berlin bringt neben Programmierung (Python, C#) und Datenbanken vor allem eine zweite Perspektive mit: Ich denke Anforderungen von der fachlichen Seite her und übersetze zwischen Business und Technik. Für ein cross-funktionales Team, das gesellschaftliche Problemstellungen in Public Sector und Energy in reale Lösungen überführt, sehe ich darin einen echten Mehrwert. Offen sage ich auch, wo ich stehe: Meine Tests führe ich bislang manuell aus; die Automatisierung mit Selenium, Cypress und JUnit baue ich derzeit im Selbststudium auf, mit eigenen kleinen Testprojekten und der klaren Absicht, das bei Ihnen in die Praxis zu bringen. Und statt Jira oder TestRail nutze ich Azure DevOps – der Umstieg ist eine Frage von Tagen, die Konzepte dahinter sind dieselben.</w:t>
       </w:r>
     </w:p>
     <w:p>

</xml_diff>

<commit_message>
Rewrite the cover letter as an argument rather than a prose CV
The previous version walked through skills, tools and stations paragraph by
paragraph. Replace it with a single line of reasoning: most defects live in the
cases nobody specified, which is why requirements review with the product
manager matters, which is why testing AI-driven systems - where the expected
result is itself unclear - is the interesting next step. Tools appear once,
where they carry the argument. Test automation is framed as the next step
rather than a gap, and the Azure DevOps/Jira comparison is dropped.

Co-Authored-By: Claude Opus 5 <noreply@anthropic.com>
Claude-Session: https://claude.ai/code/session_01FU9RUXkiipMM9QnkLyeQPz
</commit_message>
<xml_diff>
--- a/output/Anschreiben_PwC_QA.docx
+++ b/output/Anschreiben_PwC_QA.docx
@@ -116,7 +116,7 @@
         <w:spacing w:after="160"/>
       </w:pPr>
       <w:r>
-        <w:t>Software wird selten dort brüchig, wo alles nach Plan läuft, sondern in den Ausnahmen: im leeren Datensatz, im doppelten Klick, im Sonderfall, den niemand vorgesehen hat. Genau diese „Unlucky Paths“ zu finden, ist das, was ich seit Dezember 2025 als Werkstudent in der Qualitätssicherung bei der AKG Software Consulting GmbH täglich tue – und weshalb mich Ihre Ausschreibung im PET AI Tech-Hub unmittelbar angesprochen hat.</w:t>
+        <w:t>die meisten Fehler, die ich finde, stecken nicht in der Funktion selbst. Die tut in der Regel, was sie soll. Sie stecken daneben: im Feld, das jemand leer lässt, in der Reihenfolge, in der niemand geklickt hätte, im Datensatz aus einem Altsystem, der anders aussieht als das Beispiel in der Anforderung. Seit Dezember teste ich bei der AKG Software Consulting GmbH Software, bevor sie freigegeben wird, und das ist die Sache, die ich aus den ersten Monaten mitnehme: Der vorgesehene Ablauf ist schnell geprüft. Aufwendig wird es dort, wo die Anforderung nichts mehr vorgibt.</w:t>
       </w:r>
     </w:p>
     <w:p>
@@ -124,7 +124,7 @@
         <w:spacing w:after="160"/>
       </w:pPr>
       <w:r>
-        <w:t>In der Produktabnahme plane und führe ich Softwaretests durch: vom Testfallentwurf über die Ausführung bis zur Abnahmeempfehlung. Die Testpläne dazu erstelle ich in enger Zusammenarbeit mit unserem Produktmanager – aus den Produktanforderungen leiten wir gemeinsam Testumfang, Testszenarien und Abnahmekriterien ab. Neben dem manuellen Test gehören API- und Performance-Tests zu meinen Aufgaben: Schnittstellen gegen die Spezifikation zu prüfen und zu sehen, wie sich das System unter Last verhält. Wir arbeiten in Sprints, sodass ich gewohnt bin, den Testumfang eng am Entwicklungszyklus abzustimmen.</w:t>
+        <w:t>Deshalb ist mir der Teil vor dem Testen inzwischen fast wichtiger als das Testen selbst. Wenn ich mit unserem Produktmanager die Anforderungen für einen Testplan durchgehe, stellt sich regelmäßig heraus, dass ein Satz zwei Lesarten zulässt und niemand entschieden hat, welche gilt. So etwas findet man später durch Testen nicht mehr zuverlässig – man findet es, wenn man vorher fragt, was eigentlich passieren soll, wenn der Sonderfall eintritt. Was danach kommt, ist Handwerk: Testfälle schreiben, sie in Azure DevOps Test Plans verwalten, Fehler so dokumentieren, dass die Entwicklung ohne Rückfrage damit arbeiten kann, nachtesten, abnehmen.</w:t>
       </w:r>
     </w:p>
     <w:p>
@@ -132,7 +132,7 @@
         <w:spacing w:after="160"/>
       </w:pPr>
       <w:r>
-        <w:t>Testfälle und Testläufe verwalte ich in Azure DevOps Test Plans; gefundene Fehler erfasse ich reproduzierbar, priorisiere sie und verfolge sie bis zum Retest nach – über Git beziehungsweise Azure Repos ordne ich sie versionsgenau dem jeweiligen Codestand zu. Dabei habe ich gelernt, dass ein Fehlerbericht erst dann gut ist, wenn die Entwicklung ohne Rückfrage damit arbeiten kann; kommunikationsstarkes Fehlerreporting ist für mich kein Nebenprodukt, sondern Teil der Aufgabe.</w:t>
+        <w:t>Im PET AI Tech-Hub stellt sich diese Frage – was ist eigentlich das richtige Ergebnis? – unter deutlich schwierigeren Bedingungen. Bei klassischer Software gibt es einen Sollwert, den ich gegen die Anforderung halten kann. Bei einem Modell gibt es eine Menge von Ausgaben, die alle plausibel aussehen, und die Frage, ab wann eine davon falsch genug ist, um ein Fehler zu sein. Darauf habe ich keine fertige Antwort. Es ist aber genau die Art von Problem, an der ich als Nächstes arbeiten möchte, und aus dem Studium bringe ich mit Python und SQL zumindest genug mit, um mir Datenstände und Testdaten selbst anzusehen.</w:t>
       </w:r>
     </w:p>
     <w:p>
@@ -140,7 +140,7 @@
         <w:spacing w:after="160"/>
       </w:pPr>
       <w:r>
-        <w:t>Mein Studium des Wirtschaftsingenieurwesens an der HTW Berlin bringt neben Programmierung (Python, C#) und Datenbanken vor allem eine zweite Perspektive mit: Ich denke Anforderungen von der fachlichen Seite her und übersetze zwischen Business und Technik. Für ein cross-funktionales Team, das gesellschaftliche Problemstellungen in Public Sector und Energy in reale Lösungen überführt, sehe ich darin einen echten Mehrwert. Offen sage ich auch, wo ich stehe: Meine Tests führe ich bislang manuell aus; die Automatisierung mit Selenium, Cypress und JUnit baue ich derzeit im Selbststudium auf, mit eigenen kleinen Testprojekten und der klaren Absicht, das bei Ihnen in die Praxis zu bringen. Und statt Jira oder TestRail nutze ich Azure DevOps – der Umstieg ist eine Frage von Tagen, die Konzepte dahinter sind dieselben.</w:t>
+        <w:t>Dazu kommt, wo diese Systeme eingesetzt werden. Wer einen Antrag stellen muss oder auf eine Netzabrechnung wartet, kann nicht zur Konkurrenz wechseln, wenn das Formular hakt. Im öffentlichen Sektor und in der Energiewirtschaft gibt es diesen Ausweg nicht – das ist für mich ein guter Grund, genauer hinzusehen, als es wirtschaftlich zwingend wäre.</w:t>
       </w:r>
     </w:p>
     <w:p>
@@ -148,7 +148,7 @@
         <w:spacing w:after="160"/>
       </w:pPr>
       <w:r>
-        <w:t>Die Verbindung aus Digitalisierung, Energiewende und öffentlichem Auftrag ist für mich der Bereich, in dem Qualitätssicherung am meisten zählt – dort trägt eine fehlerhafte Anwendung unmittelbar Konsequenzen für Menschen, die sie nicht umgehen können. Genau deshalb möchte ich meinen Weg in der Qualitätssicherung bei PwC weitergehen und dort deutlich tiefer einsteigen – insbesondere im Testen von KI-gestützten und datengetriebenen Systemen.</w:t>
+        <w:t>Meine Tests laufen bisher überwiegend manuell. Testautomatisierung mit Cypress bringe ich mir gerade selbst bei, und der Schritt fällt mir leichter, weil ich aus der manuellen Arbeit weiß, welche Fälle sich zu automatisieren lohnen und welche man besser einmal selbst anschaut. Diesen Schritt würde ich gern bei Ihnen machen – in einem Team, in dem QA neben Entwicklung und Produkt sitzt und nicht am Ende der Kette.</w:t>
       </w:r>
     </w:p>
     <w:p>
@@ -156,7 +156,7 @@
         <w:spacing w:after="160"/>
       </w:pPr>
       <w:r>
-        <w:t>Ab {{STARTDATUM}} stehe ich Ihnen mit {{STUNDEN}} Stunden pro Woche zur Verfügung, in der vorlesungsfreien Zeit gerne auch mit mehr. Über die Gelegenheit zu einem persönlichen Gespräch freue ich mich sehr.</w:t>
+        <w:t>Ab {{STARTDATUM}} kann ich mit {{STUNDEN}} Stunden pro Woche einsteigen, in der vorlesungsfreien Zeit auch mehr. Über ein Gespräch würde ich mich freuen.</w:t>
       </w:r>
     </w:p>
     <w:p>

</xml_diff>

<commit_message>
Raise the cover letter's register to a professional tone
Keep the argument and structure from the rewrite, but replace the colloquial
and fragmentary phrasing with complete, measured sentences: precise verbs for
the QA vocabulary, no sentence fragments, and a standard closing.

Co-Authored-By: Claude Opus 5 <noreply@anthropic.com>
Claude-Session: https://claude.ai/code/session_01FU9RUXkiipMM9QnkLyeQPz
</commit_message>
<xml_diff>
--- a/output/Anschreiben_PwC_QA.docx
+++ b/output/Anschreiben_PwC_QA.docx
@@ -116,7 +116,7 @@
         <w:spacing w:after="160"/>
       </w:pPr>
       <w:r>
-        <w:t>die meisten Fehler, die ich finde, stecken nicht in der Funktion selbst. Die tut in der Regel, was sie soll. Sie stecken daneben: im Feld, das jemand leer lässt, in der Reihenfolge, in der niemand geklickt hätte, im Datensatz aus einem Altsystem, der anders aussieht als das Beispiel in der Anforderung. Seit Dezember teste ich bei der AKG Software Consulting GmbH Software, bevor sie freigegeben wird, und das ist die Sache, die ich aus den ersten Monaten mitnehme: Der vorgesehene Ablauf ist schnell geprüft. Aufwendig wird es dort, wo die Anforderung nichts mehr vorgibt.</w:t>
+        <w:t>die meisten Fehler, die ich in der Qualitätssicherung finde, liegen nicht in der Funktion selbst, sondern daneben: im Pflichtfeld, das leer bleibt, in der Bearbeitungsreihenfolge, die niemand vorgesehen hat, im Datensatz aus einem Altsystem, der vom Beispiel in der Anforderung abweicht. Seit Dezember prüfe ich bei der AKG Software Consulting GmbH Software vor der Freigabe. Die wichtigste Erfahrung aus dieser Zeit: Der spezifizierte Ablauf ist schnell verifiziert – die eigentliche Arbeit beginnt dort, wo die Anforderung keine Vorgabe mehr macht.</w:t>
       </w:r>
     </w:p>
     <w:p>
@@ -124,7 +124,7 @@
         <w:spacing w:after="160"/>
       </w:pPr>
       <w:r>
-        <w:t>Deshalb ist mir der Teil vor dem Testen inzwischen fast wichtiger als das Testen selbst. Wenn ich mit unserem Produktmanager die Anforderungen für einen Testplan durchgehe, stellt sich regelmäßig heraus, dass ein Satz zwei Lesarten zulässt und niemand entschieden hat, welche gilt. So etwas findet man später durch Testen nicht mehr zuverlässig – man findet es, wenn man vorher fragt, was eigentlich passieren soll, wenn der Sonderfall eintritt. Was danach kommt, ist Handwerk: Testfälle schreiben, sie in Azure DevOps Test Plans verwalten, Fehler so dokumentieren, dass die Entwicklung ohne Rückfrage damit arbeiten kann, nachtesten, abnehmen.</w:t>
+        <w:t>Aus diesem Grund messe ich der Phase vor der Testdurchführung inzwischen ein ähnliches Gewicht bei wie der Durchführung selbst. Wenn ich mit unserem Produktmanager die Anforderungen für einen Testplan durchgehe, zeigt sich regelmäßig, dass eine Formulierung zwei Lesarten zulässt, ohne dass dazu eine Entscheidung getroffen wurde. Solche Unklarheiten lassen sich später durch Testen nur schwer aufdecken; sie treten zutage, wenn vorab geklärt wird, welches Verhalten im Ausnahmefall erwartet wird. Die anschließende Umsetzung folgt einem festen Rahmen: Testfälle entwerfen, in Azure DevOps Test Plans verwalten, Fehler so dokumentieren, dass die Entwicklung ohne Rückfragen damit arbeiten kann, nachtesten und abnehmen.</w:t>
       </w:r>
     </w:p>
     <w:p>
@@ -132,7 +132,7 @@
         <w:spacing w:after="160"/>
       </w:pPr>
       <w:r>
-        <w:t>Im PET AI Tech-Hub stellt sich diese Frage – was ist eigentlich das richtige Ergebnis? – unter deutlich schwierigeren Bedingungen. Bei klassischer Software gibt es einen Sollwert, den ich gegen die Anforderung halten kann. Bei einem Modell gibt es eine Menge von Ausgaben, die alle plausibel aussehen, und die Frage, ab wann eine davon falsch genug ist, um ein Fehler zu sein. Darauf habe ich keine fertige Antwort. Es ist aber genau die Art von Problem, an der ich als Nächstes arbeiten möchte, und aus dem Studium bringe ich mit Python und SQL zumindest genug mit, um mir Datenstände und Testdaten selbst anzusehen.</w:t>
+        <w:t>Im PET AI Tech-Hub stellt sich die Frage nach dem erwarteten Ergebnis unter anspruchsvolleren Bedingungen. Klassische Software lässt sich gegen einen definierten Sollwert prüfen. Bei KI-gestützten und datengetriebenen Systemen steht dem eine Menge plausibler Ausgaben gegenüber, und es ist zu entscheiden, ab wann eine Abweichung als Fehler gilt. Eine abschließende Antwort darauf habe ich nicht; es ist aber die Fragestellung, in der ich mich fachlich weiterentwickeln möchte. Aus dem Studium bringe ich mit Python und SQL die Grundlage mit, um Datenstände und Testdaten selbst zu prüfen.</w:t>
       </w:r>
     </w:p>
     <w:p>
@@ -140,7 +140,7 @@
         <w:spacing w:after="160"/>
       </w:pPr>
       <w:r>
-        <w:t>Dazu kommt, wo diese Systeme eingesetzt werden. Wer einen Antrag stellen muss oder auf eine Netzabrechnung wartet, kann nicht zur Konkurrenz wechseln, wenn das Formular hakt. Im öffentlichen Sektor und in der Energiewirtschaft gibt es diesen Ausweg nicht – das ist für mich ein guter Grund, genauer hinzusehen, als es wirtschaftlich zwingend wäre.</w:t>
+        <w:t>Hinzu kommt der Einsatzkontext. Wer einen Antrag einreicht oder auf die Abrechnung seines Energieversorgers wartet, kann bei einer fehlerhaften Anwendung nicht auf einen anderen Anbieter ausweichen. Im öffentlichen Sektor und in der Energiewirtschaft entfällt dieser Ausweg – für mich ein Grund, sorgfältiger zu prüfen, als es wirtschaftlich zwingend wäre.</w:t>
       </w:r>
     </w:p>
     <w:p>
@@ -148,7 +148,7 @@
         <w:spacing w:after="160"/>
       </w:pPr>
       <w:r>
-        <w:t>Meine Tests laufen bisher überwiegend manuell. Testautomatisierung mit Cypress bringe ich mir gerade selbst bei, und der Schritt fällt mir leichter, weil ich aus der manuellen Arbeit weiß, welche Fälle sich zu automatisieren lohnen und welche man besser einmal selbst anschaut. Diesen Schritt würde ich gern bei Ihnen machen – in einem Team, in dem QA neben Entwicklung und Produkt sitzt und nicht am Ende der Kette.</w:t>
+        <w:t>Meine Tests führe ich bislang überwiegend manuell durch; die Automatisierung mit Cypress eigne ich mir derzeit im Selbststudium an. Der Übergang fällt mir leichter, weil ich aus der manuellen Arbeit einschätzen kann, welche Fälle sich für eine Automatisierung eignen und welche eine gezielte Prüfung erfordern. Diesen Schritt möchte ich in einem Team gehen, in dem die Qualitätssicherung eng mit Entwicklung und Produktmanagement zusammenarbeitet und nicht am Ende der Prozesskette steht.</w:t>
       </w:r>
     </w:p>
     <w:p>
@@ -156,7 +156,7 @@
         <w:spacing w:after="160"/>
       </w:pPr>
       <w:r>
-        <w:t>Ab {{STARTDATUM}} kann ich mit {{STUNDEN}} Stunden pro Woche einsteigen, in der vorlesungsfreien Zeit auch mehr. Über ein Gespräch würde ich mich freuen.</w:t>
+        <w:t>Ab {{STARTDATUM}} stehe ich Ihnen mit {{STUNDEN}} Stunden pro Woche zur Verfügung, in der vorlesungsfreien Zeit auch darüber hinaus. Über die Einladung zu einem Gespräch freue ich mich.</w:t>
       </w:r>
     </w:p>
     <w:p>

</xml_diff>

<commit_message>
Rewrite the cover letter with a motivated, expert voice
Replace the analytical tone with a candidate speaking in first person about
work they care about: an opening that states why QA held their interest, the
test-planning and API work as concrete evidence, and domain knowledge on
evaluating non-deterministic model output as the reason for applying here
specifically. Closes with a confident call to action.

Co-Authored-By: Claude Opus 5 <noreply@anthropic.com>
Claude-Session: https://claude.ai/code/session_01FU9RUXkiipMM9QnkLyeQPz
</commit_message>
<xml_diff>
--- a/output/Anschreiben_PwC_QA.docx
+++ b/output/Anschreiben_PwC_QA.docx
@@ -116,7 +116,7 @@
         <w:spacing w:after="160"/>
       </w:pPr>
       <w:r>
-        <w:t>die meisten Fehler, die ich in der Qualitätssicherung finde, liegen nicht in der Funktion selbst, sondern daneben: im Pflichtfeld, das leer bleibt, in der Bearbeitungsreihenfolge, die niemand vorgesehen hat, im Datensatz aus einem Altsystem, der vom Beispiel in der Anforderung abweicht. Seit Dezember prüfe ich bei der AKG Software Consulting GmbH Software vor der Freigabe. Die wichtigste Erfahrung aus dieser Zeit: Der spezifizierte Ablauf ist schnell verifiziert – die eigentliche Arbeit beginnt dort, wo die Anforderung keine Vorgabe mehr macht.</w:t>
+        <w:t>in der Qualitätssicherung bin ich gelandet, ohne es geplant zu haben – geblieben bin ich, weil mich kaum etwas so fasziniert wie der Moment, in dem ein System genau an der Stelle bricht, die im Konzept nicht vorgesehen war. Seit Dezember prüfe ich bei der AKG Software Consulting GmbH Software vor der Freigabe, und ich möchte diesen Weg dort fortsetzen, wo er anspruchsvoller wird: im PET AI Tech-Hub.</w:t>
       </w:r>
     </w:p>
     <w:p>
@@ -124,7 +124,7 @@
         <w:spacing w:after="160"/>
       </w:pPr>
       <w:r>
-        <w:t>Aus diesem Grund messe ich der Phase vor der Testdurchführung inzwischen ein ähnliches Gewicht bei wie der Durchführung selbst. Wenn ich mit unserem Produktmanager die Anforderungen für einen Testplan durchgehe, zeigt sich regelmäßig, dass eine Formulierung zwei Lesarten zulässt, ohne dass dazu eine Entscheidung getroffen wurde. Solche Unklarheiten lassen sich später durch Testen nur schwer aufdecken; sie treten zutage, wenn vorab geklärt wird, welches Verhalten im Ausnahmefall erwartet wird. Die anschließende Umsetzung folgt einem festen Rahmen: Testfälle entwerfen, in Azure DevOps Test Plans verwalten, Fehler so dokumentieren, dass die Entwicklung ohne Rückfragen damit arbeiten kann, nachtesten und abnehmen.</w:t>
+        <w:t>Meine Arbeit beginnt nicht bei der Testausführung. Testpläne erstelle ich gemeinsam mit unserem Produktmanager – wir gehen die Anforderungen durch, leiten Testszenarien und Abnahmekriterien ab und klären die Fälle, zu denen die Spezifikation schweigt. Erfahrungsgemäß sind das genau die Fälle, die später teuer werden. Die Testfälle verwalte ich in Azure DevOps Test Plans, Schnittstellen prüfe ich per API-Test gegen die Spezifikation, und ich sehe mir an, wie sich das System unter Last verhält. Gefundene Fehler dokumentiere ich so, dass die Entwicklung ohne eine einzige Rückfrage damit arbeiten kann – das ist der Maßstab, den ich an meine eigene Arbeit anlege.</w:t>
       </w:r>
     </w:p>
     <w:p>
@@ -132,7 +132,7 @@
         <w:spacing w:after="160"/>
       </w:pPr>
       <w:r>
-        <w:t>Im PET AI Tech-Hub stellt sich die Frage nach dem erwarteten Ergebnis unter anspruchsvolleren Bedingungen. Klassische Software lässt sich gegen einen definierten Sollwert prüfen. Bei KI-gestützten und datengetriebenen Systemen steht dem eine Menge plausibler Ausgaben gegenüber, und es ist zu entscheiden, ab wann eine Abweichung als Fehler gilt. Eine abschließende Antwort darauf habe ich nicht; es ist aber die Fragestellung, in der ich mich fachlich weiterentwickeln möchte. Aus dem Studium bringe ich mit Python und SQL die Grundlage mit, um Datenstände und Testdaten selbst zu prüfen.</w:t>
+        <w:t>Warum ich mich gerade bei Ihnen bewerbe, liegt am KI-Anteil Ihrer Projekte. Bei klassischer Software habe ich einen definierten Sollwert, gegen den ich prüfe. Ein Modell liefert stattdessen Ausgaben, die plausibel wirken und trotzdem falsch sein können. Testen heißt dort, die Kriterien überhaupt erst zu definieren, mit Referenzdaten zu arbeiten und Verhalten statistisch statt binär zu bewerten. Ich habe mich in dieses Thema eingelesen, weil es mich fachlich reizt – und ich möchte daran arbeiten, statt weiter darüber zu lesen. Aus dem Studium bringe ich mit Python und SQL die Grundlage mit, um Datenstände und Testdaten selbst zu prüfen.</w:t>
       </w:r>
     </w:p>
     <w:p>
@@ -140,7 +140,7 @@
         <w:spacing w:after="160"/>
       </w:pPr>
       <w:r>
-        <w:t>Hinzu kommt der Einsatzkontext. Wer einen Antrag einreicht oder auf die Abrechnung seines Energieversorgers wartet, kann bei einer fehlerhaften Anwendung nicht auf einen anderen Anbieter ausweichen. Im öffentlichen Sektor und in der Energiewirtschaft entfällt dieser Ausweg – für mich ein Grund, sorgfältiger zu prüfen, als es wirtschaftlich zwingend wäre.</w:t>
+        <w:t>Dass dies im öffentlichen Sektor und in der Energiewirtschaft stattfindet, macht die Aufgabe für mich relevanter, nicht kleiner. Eine Anwendung, die Bürgerinnen und Bürger, Kommunen oder Netzbetreiber nutzen müssen, kann niemand abwählen, wenn sie fehlerhaft ist. Qualität ist dort keine Frage der Kundenzufriedenheit, sondern der Verlässlichkeit.</w:t>
       </w:r>
     </w:p>
     <w:p>
@@ -148,7 +148,7 @@
         <w:spacing w:after="160"/>
       </w:pPr>
       <w:r>
-        <w:t>Meine Tests führe ich bislang überwiegend manuell durch; die Automatisierung mit Cypress eigne ich mir derzeit im Selbststudium an. Der Übergang fällt mir leichter, weil ich aus der manuellen Arbeit einschätzen kann, welche Fälle sich für eine Automatisierung eignen und welche eine gezielte Prüfung erfordern. Diesen Schritt möchte ich in einem Team gehen, in dem die Qualitätssicherung eng mit Entwicklung und Produktmanagement zusammenarbeitet und nicht am Ende der Prozesskette steht.</w:t>
+        <w:t>Meine Tests führe ich bislang überwiegend manuell durch. Cypress eigne ich mir gerade im Selbststudium an, und dabei merke ich, wie sehr die manuelle Erfahrung trägt: Ich weiß inzwischen, welche Fälle sich als Regressionstests zu automatisieren lohnen und welche eine gezielte Prüfung von Hand brauchen. Diesen Schritt möchte ich in einem cross-funktionalen Team machen, in dem die Qualitätssicherung von Anfang an mit am Tisch sitzt.</w:t>
       </w:r>
     </w:p>
     <w:p>
@@ -156,7 +156,7 @@
         <w:spacing w:after="160"/>
       </w:pPr>
       <w:r>
-        <w:t>Ab {{STARTDATUM}} stehe ich Ihnen mit {{STUNDEN}} Stunden pro Woche zur Verfügung, in der vorlesungsfreien Zeit auch darüber hinaus. Über die Einladung zu einem Gespräch freue ich mich.</w:t>
+        <w:t>Ab {{STARTDATUM}} stehe ich Ihnen mit {{STUNDEN}} Stunden pro Woche zur Verfügung, in der vorlesungsfreien Zeit auch darüber hinaus. Gern zeige ich Ihnen im Gespräch, wie ich an einen Testfall herangehe.</w:t>
       </w:r>
     </w:p>
     <w:p>

</xml_diff>

<commit_message>
Rewrite the cover letter in the applicant's own voice and fill in real details
Match the register and paragraph logic of the applicant's existing Siemens
letter: plain declarative sentences, a concrete opening about the current role,
a separate paragraph on why this employer, an AI paragraph in their established
style, and their usual closing. Fill in name, address and phone, drop the date
of birth and LinkedIn lines, and name the product under test (Vestra
InfraVision) in both documents.

Co-Authored-By: Claude Opus 5 <noreply@anthropic.com>
Claude-Session: https://claude.ai/code/session_01FU9RUXkiipMM9QnkLyeQPz
</commit_message>
<xml_diff>
--- a/output/Anschreiben_PwC_QA.docx
+++ b/output/Anschreiben_PwC_QA.docx
@@ -7,7 +7,7 @@
         <w:spacing w:after="0"/>
       </w:pPr>
       <w:r>
-        <w:t>{{NAME}}</w:t>
+        <w:t>Pouya Shakourpour Shireh Jini</w:t>
       </w:r>
     </w:p>
     <w:p>
@@ -15,7 +15,7 @@
         <w:spacing w:after="0"/>
       </w:pPr>
       <w:r>
-        <w:t>{{ANSCHRIFT}}</w:t>
+        <w:t>Scheffelstr. 45, 10367 Berlin</w:t>
       </w:r>
     </w:p>
     <w:p>
@@ -23,7 +23,7 @@
         <w:spacing w:after="0"/>
       </w:pPr>
       <w:r>
-        <w:t>Telefon: {{TELEFON}}</w:t>
+        <w:t>Telefon: 0176 80782540</w:t>
       </w:r>
     </w:p>
     <w:p>
@@ -32,22 +32,6 @@
       </w:pPr>
       <w:r>
         <w:t>E-Mail: pouyapouya144@gmail.com</w:t>
-      </w:r>
-    </w:p>
-    <w:p>
-      <w:pPr>
-        <w:spacing w:after="0"/>
-      </w:pPr>
-      <w:r>
-        <w:t>Geburtsdatum: {{GEBURT}}</w:t>
-      </w:r>
-    </w:p>
-    <w:p>
-      <w:pPr>
-        <w:spacing w:after="0"/>
-      </w:pPr>
-      <w:r>
-        <w:t>LinkedIn: {{LINKEDIN}}</w:t>
       </w:r>
     </w:p>
     <w:p/>
@@ -72,6 +56,14 @@
         <w:spacing w:after="0"/>
       </w:pPr>
       <w:r>
+        <w:t>Recruiting / Human Resources</w:t>
+      </w:r>
+    </w:p>
+    <w:p>
+      <w:pPr>
+        <w:spacing w:after="0"/>
+      </w:pPr>
+      <w:r>
         <w:t>Public &amp; Energy Transformation – PET AI Tech-Hub</w:t>
       </w:r>
     </w:p>
@@ -80,7 +72,7 @@
         <w:spacing w:after="0"/>
       </w:pPr>
       <w:r>
-        <w:t>{{FIRMA_ADRESSE}}</w:t>
+        <w:t>{{STANDORT}}</w:t>
       </w:r>
     </w:p>
     <w:p/>
@@ -89,7 +81,7 @@
         <w:jc w:val="right"/>
       </w:pPr>
       <w:r>
-        <w:t>Berlin, {{DATUM}}</w:t>
+        <w:t>Berlin, den {{DATUM}}</w:t>
       </w:r>
     </w:p>
     <w:p>
@@ -116,7 +108,7 @@
         <w:spacing w:after="160"/>
       </w:pPr>
       <w:r>
-        <w:t>in der Qualitätssicherung bin ich gelandet, ohne es geplant zu haben – geblieben bin ich, weil mich kaum etwas so fasziniert wie der Moment, in dem ein System genau an der Stelle bricht, die im Konzept nicht vorgesehen war. Seit Dezember prüfe ich bei der AKG Software Consulting GmbH Software vor der Freigabe, und ich möchte diesen Weg dort fortsetzen, wo er anspruchsvoller wird: im PET AI Tech-Hub.</w:t>
+        <w:t>in meiner aktuellen Werkstudentenstelle bei der AKG Software Consulting GmbH arbeite ich in der Qualitätssicherung für die Planungssoftware Vestra InfraVision, die in der Trassierung und Infrastrukturplanung von Schienennetzen eingesetzt wird. Ich teste die Software vor der Freigabe, erstelle die Testpläne gemeinsam mit dem Produktmanagement und verfolge gefundene Fehler bis zur Behebung nach. Diese Tätigkeit hat mir gezeigt, wie viel Verantwortung in der Qualitätssicherung von Software steckt, die in öffentlicher Infrastruktur eingesetzt wird. Genau deshalb überzeugt mich die Perspektive, diese Arbeit im PET AI Tech-Hub bei PwC fortzusetzen.</w:t>
       </w:r>
     </w:p>
     <w:p>
@@ -124,7 +116,7 @@
         <w:spacing w:after="160"/>
       </w:pPr>
       <w:r>
-        <w:t>Meine Arbeit beginnt nicht bei der Testausführung. Testpläne erstelle ich gemeinsam mit unserem Produktmanager – wir gehen die Anforderungen durch, leiten Testszenarien und Abnahmekriterien ab und klären die Fälle, zu denen die Spezifikation schweigt. Erfahrungsgemäß sind das genau die Fälle, die später teuer werden. Die Testfälle verwalte ich in Azure DevOps Test Plans, Schnittstellen prüfe ich per API-Test gegen die Spezifikation, und ich sehe mir an, wie sich das System unter Last verhält. Gefundene Fehler dokumentiere ich so, dass die Entwicklung ohne eine einzige Rückfrage damit arbeiten kann – das ist der Maßstab, den ich an meine eigene Arbeit anlege.</w:t>
+        <w:t>Der Bereich Public Sector &amp; Energy passt für mich gut zu dem, was ich bisher gemacht habe. Die Software, die ich heute teste, wird für die Planung von Schienennetzen genutzt, also für Vorhaben mit langer Laufzeit und öffentlicher Wirkung. Fehler fallen dort selten sofort auf, sondern erst dann, wenn ihre Korrektur aufwendig wird. Dass PwC Bund, Länder und Kommunen bei der Digitalisierung und der Energiewende begleitet, betrifft genau diese Art von Anwendungen.</w:t>
       </w:r>
     </w:p>
     <w:p>
@@ -132,7 +124,7 @@
         <w:spacing w:after="160"/>
       </w:pPr>
       <w:r>
-        <w:t>Warum ich mich gerade bei Ihnen bewerbe, liegt am KI-Anteil Ihrer Projekte. Bei klassischer Software habe ich einen definierten Sollwert, gegen den ich prüfe. Ein Modell liefert stattdessen Ausgaben, die plausibel wirken und trotzdem falsch sein können. Testen heißt dort, die Kriterien überhaupt erst zu definieren, mit Referenzdaten zu arbeiten und Verhalten statistisch statt binär zu bewerten. Ich habe mich in dieses Thema eingelesen, weil es mich fachlich reizt – und ich möchte daran arbeiten, statt weiter darüber zu lesen. Aus dem Studium bringe ich mit Python und SQL die Grundlage mit, um Datenstände und Testdaten selbst zu prüfen.</w:t>
+        <w:t>Künstliche Intelligenz gehört für mich inzwischen selbstverständlich zum Alltag im Studium und bei der Arbeit. Dabei ist mir wichtig, KI nicht einfach nur zu verwenden, sondern ihre Ergebnisse einzuschätzen. Mir fällt regelmäßig auf, wie unterschiedlich die Qualität ausfällt und wie plausibel eine falsche Antwort wirken kann. Aus Sicht der Qualitätssicherung ist das die eigentlich schwierige Frage: Bei klassischer Software prüfe ich gegen einen festgelegten Sollwert, bei einem KI-gestützten System muss zuerst definiert werden, ab wann ein Ergebnis überhaupt als falsch gilt. Genau daran würde ich gern arbeiten.</w:t>
       </w:r>
     </w:p>
     <w:p>
@@ -140,7 +132,7 @@
         <w:spacing w:after="160"/>
       </w:pPr>
       <w:r>
-        <w:t>Dass dies im öffentlichen Sektor und in der Energiewirtschaft stattfindet, macht die Aufgabe für mich relevanter, nicht kleiner. Eine Anwendung, die Bürgerinnen und Bürger, Kommunen oder Netzbetreiber nutzen müssen, kann niemand abwählen, wenn sie fehlerhaft ist. Qualität ist dort keine Frage der Kundenzufriedenheit, sondern der Verlässlichkeit.</w:t>
+        <w:t>Qualitätssicherung ist das Feld, in dem ich meine Werkstudententätigkeit fortsetzen möchte – nicht aus einem allgemeinen Interesse heraus, sondern weil ich dort meine persönlichen Stärken am besten einbringen kann: genaues Arbeiten, technisches Verständnis und eine klare Kommunikation gegenüber Entwicklung und Fachbereich. Meine Tests führe ich bisher überwiegend manuell durch, ergänzt um API- und Performance-Tests. Testautomatisierung mit Cypress eigne ich mir derzeit selbst an, weil ich den nächsten fachlichen Schritt machen möchte. Aus dem Studium bringe ich mit Python und SQL die Grundlagen mit, um Testdaten und Datenstände selbst zu prüfen.</w:t>
       </w:r>
     </w:p>
     <w:p>
@@ -148,7 +140,7 @@
         <w:spacing w:after="160"/>
       </w:pPr>
       <w:r>
-        <w:t>Meine Tests führe ich bislang überwiegend manuell durch. Cypress eigne ich mir gerade im Selbststudium an, und dabei merke ich, wie sehr die manuelle Erfahrung trägt: Ich weiß inzwischen, welche Fälle sich als Regressionstests zu automatisieren lohnen und welche eine gezielte Prüfung von Hand brauchen. Diesen Schritt möchte ich in einem cross-funktionalen Team machen, in dem die Qualitätssicherung von Anfang an mit am Tisch sitzt.</w:t>
+        <w:t>Ab {{STARTDATUM}} stehe ich Ihnen mit {{STUNDEN}} Stunden pro Woche zur Verfügung. Über eine Einladung zum persönlichen Gespräch freue ich mich sehr.</w:t>
       </w:r>
     </w:p>
     <w:p>
@@ -156,7 +148,7 @@
         <w:spacing w:after="160"/>
       </w:pPr>
       <w:r>
-        <w:t>Ab {{STARTDATUM}} stehe ich Ihnen mit {{STUNDEN}} Stunden pro Woche zur Verfügung, in der vorlesungsfreien Zeit auch darüber hinaus. Gern zeige ich Ihnen im Gespräch, wie ich an einen Testfall herangehe.</w:t>
+        <w:t>Mit freundlichen Grüßen,</w:t>
       </w:r>
     </w:p>
     <w:p>
@@ -164,15 +156,7 @@
         <w:spacing w:after="160"/>
       </w:pPr>
       <w:r>
-        <w:t>Mit freundlichen Grüßen</w:t>
-      </w:r>
-    </w:p>
-    <w:p>
-      <w:pPr>
-        <w:spacing w:after="160"/>
-      </w:pPr>
-      <w:r>
-        <w:t>{{NAME}}</w:t>
+        <w:t>Pouya Shakourpour Shireh Jini</w:t>
       </w:r>
     </w:p>
     <w:p>
@@ -185,7 +169,7 @@
           <w:color w:val="888888"/>
           <w:sz w:val="18"/>
         </w:rPr>
-        <w:t>HINWEIS (vor Versand löschen): Platzhalter {{...}} ersetzen (Adresse des Standorts, auf den du dich bewirbst, Datum, Referenznummer aus der Anzeige) und diese Zeile entfernen.</w:t>
+        <w:t>HINWEIS (vor Versand löschen): {{STANDORT}}, {{DATUM}}, {{REFERENZ}}, {{STUNDEN}} und {{STARTDATUM}} eintragen und diese Zeile entfernen.</w:t>
       </w:r>
     </w:p>
     <w:sectPr>

</xml_diff>